<commit_message>
fixes done for pdf and other changes at 14Jan2026
</commit_message>
<xml_diff>
--- a/sample/notice.docx
+++ b/sample/notice.docx
@@ -13,121 +13,7 @@
           <w:b/>
           <w:bCs/>
         </w:rPr>
-        <w:t>Subject: Notice under Section 133(6) of the Income Tax Act, 1961 – Assessment Year 2025-26 – Calling for Information in the case of Rahul Sharma.</w:t>
-      </w:r>
-    </w:p>
-    <w:p>
-      <w:pPr>
-        <w:pStyle w:val="NormalWeb"/>
-        <w:spacing w:before="280" w:after="280"/>
-        <w:rPr/>
-      </w:pPr>
-      <w:r>
-        <w:rPr/>
-        <w:t>Sir/Madam,</w:t>
-      </w:r>
-    </w:p>
-    <w:p>
-      <w:pPr>
-        <w:pStyle w:val="NormalWeb"/>
-        <w:spacing w:before="280" w:after="280"/>
-        <w:rPr/>
-      </w:pPr>
-      <w:r>
-        <w:rPr/>
-        <w:t>In connection with the assessment proceedings currently pending in the case of {{ assessee_name }}</w:t>
-      </w:r>
-      <w:r>
-        <w:rPr>
-          <w:b/>
-          <w:bCs/>
-        </w:rPr>
-        <w:t>, PAN: {{ pan }}</w:t>
-      </w:r>
-      <w:r>
-        <w:rPr/>
-        <w:t xml:space="preserve"> for the </w:t>
-      </w:r>
-      <w:r>
-        <w:rPr>
-          <w:b/>
-          <w:bCs/>
-        </w:rPr>
-        <w:t>Assessment Year {{ assessment_year }}</w:t>
-      </w:r>
-      <w:r>
-        <w:rPr/>
-        <w:t>, you are requested to furnish the following information/documents:</w:t>
-      </w:r>
-    </w:p>
-    <w:p>
-      <w:pPr>
-        <w:pStyle w:val="NormalWeb"/>
-        <w:numPr>
-          <w:ilvl w:val="0"/>
-          <w:numId w:val="1"/>
-        </w:numPr>
-        <w:spacing w:before="280" w:after="0"/>
-        <w:rPr/>
-      </w:pPr>
-      <w:r>
-        <w:rPr>
-          <w:b/>
-          <w:bCs/>
-        </w:rPr>
-        <w:t>Confirmation of Tenancy: Confirm whether you were the owner and landlord of the property situated at Sunrish Apartment, Noida during the Financial Year {{ financial_year }}, {{ assessment_year }}.</w:t>
-      </w:r>
-      <w:r>
-        <w:rPr/>
-      </w:r>
-      <w:r>
-        <w:rPr>
-          <w:rFonts w:eastAsia="Times New Roman" w:cs="Times New Roman"/>
-          <w:sz w:val="24"/>
-          <w:szCs w:val="24"/>
-          <w:lang w:eastAsia="en-IN"/>
-        </w:rPr>
-      </w:r>
-      <w:r>
-        <w:rPr>
-          <w:rFonts w:eastAsia="Times New Roman" w:cs="Times New Roman"/>
-          <w:sz w:val="24"/>
-          <w:szCs w:val="24"/>
-          <w:lang w:eastAsia="en-IN"/>
-        </w:rPr>
-      </w:r>
-      <w:r>
-        <w:rPr>
-          <w:rFonts w:eastAsia="Times New Roman" w:cs="Times New Roman"/>
-          <w:sz w:val="24"/>
-          <w:szCs w:val="24"/>
-          <w:lang w:eastAsia="en-IN"/>
-        </w:rPr>
-      </w:r>
-      <w:r>
-        <w:rPr/>
-      </w:r>
-    </w:p>
-    <w:p>
-      <w:pPr>
-        <w:pStyle w:val="NormalWeb"/>
-        <w:numPr>
-          <w:ilvl w:val="0"/>
-          <w:numId w:val="1"/>
-        </w:numPr>
-        <w:spacing w:before="0" w:after="0"/>
-        <w:rPr/>
-      </w:pPr>
-      <w:r>
-        <w:rPr>
-          <w:b/>
-          <w:bCs/>
-        </w:rPr>
-        <w:t>Rent Details:</w:t>
-      </w:r>
-      <w:r>
-        <w:rPr/>
-        <w:t xml:space="preserve"> State the total amount of rent received by you from </w:t>
+        <w:t xml:space="preserve">Subject: Notice under Section 133(6) of the Income Tax Act, 1961 – Assessment Year {{ assessment_year }} – Calling for Information in the case of </w:t>
       </w:r>
       <w:r>
         <w:rPr>
@@ -140,6 +26,108 @@
         </w:rPr>
         <w:t>{{ assessee_name }}</w:t>
       </w:r>
+      <w:r>
+        <w:rPr>
+          <w:b/>
+          <w:bCs/>
+        </w:rPr>
+        <w:t>.</w:t>
+      </w:r>
+    </w:p>
+    <w:p>
+      <w:pPr>
+        <w:pStyle w:val="NormalWeb"/>
+        <w:spacing w:before="280" w:after="280"/>
+        <w:rPr/>
+      </w:pPr>
+      <w:r>
+        <w:rPr/>
+        <w:t>Sir/Madam,</w:t>
+      </w:r>
+    </w:p>
+    <w:p>
+      <w:pPr>
+        <w:pStyle w:val="NormalWeb"/>
+        <w:spacing w:before="280" w:after="280"/>
+        <w:rPr/>
+      </w:pPr>
+      <w:r>
+        <w:rPr/>
+        <w:t xml:space="preserve">In connection with the assessment proceedings currently pending in the case of </w:t>
+      </w:r>
+      <w:r>
+        <w:rPr>
+          <w:b/>
+          <w:bCs/>
+        </w:rPr>
+        <w:t>{{ assessee_name }}, PAN: {{ pan }}</w:t>
+      </w:r>
+      <w:r>
+        <w:rPr/>
+        <w:t xml:space="preserve"> for the </w:t>
+      </w:r>
+      <w:r>
+        <w:rPr>
+          <w:b/>
+          <w:bCs/>
+        </w:rPr>
+        <w:t>Assessment Year {{ assessment_year }}</w:t>
+      </w:r>
+      <w:r>
+        <w:rPr/>
+        <w:t>, you are requested to furnish the following information/documents:</w:t>
+      </w:r>
+    </w:p>
+    <w:p>
+      <w:pPr>
+        <w:pStyle w:val="NormalWeb"/>
+        <w:numPr>
+          <w:ilvl w:val="0"/>
+          <w:numId w:val="1"/>
+        </w:numPr>
+        <w:spacing w:before="280" w:after="0"/>
+        <w:rPr/>
+      </w:pPr>
+      <w:r>
+        <w:rPr>
+          <w:b/>
+          <w:bCs/>
+        </w:rPr>
+        <w:t>Confirmation of Tenancy: Confirm whether you were the owner and landlord of the property situated at Sunrish Apartment, Noida during the Financial Year {{ financial_year }}, {{ assessment_year }}.</w:t>
+      </w:r>
+    </w:p>
+    <w:p>
+      <w:pPr>
+        <w:pStyle w:val="NormalWeb"/>
+        <w:numPr>
+          <w:ilvl w:val="0"/>
+          <w:numId w:val="1"/>
+        </w:numPr>
+        <w:spacing w:before="0" w:after="0"/>
+        <w:rPr/>
+      </w:pPr>
+      <w:r>
+        <w:rPr>
+          <w:b/>
+          <w:bCs/>
+        </w:rPr>
+        <w:t>Rent Details:</w:t>
+      </w:r>
+      <w:r>
+        <w:rPr/>
+        <w:t xml:space="preserve"> State the total amount of rent received by you from </w:t>
+      </w:r>
+      <w:r>
+        <w:rPr>
+          <w:rFonts w:eastAsia="Times New Roman" w:cs="Times New Roman"/>
+          <w:b/>
+          <w:bCs/>
+          <w:sz w:val="24"/>
+          <w:szCs w:val="24"/>
+          <w:lang w:eastAsia="en-IN"/>
+        </w:rPr>
+        <w:t>{{ assessee_name }}</w:t>
+      </w:r>
     </w:p>
     <w:p>
       <w:pPr>
@@ -248,6 +236,22 @@
       <w:r>
         <w:rPr/>
         <w:t xml:space="preserve"> Provide a copy of your bank account statement highlighting the entries where the rent paid by the tenant was credited (if paid via banking channels).</w:t>
+      </w:r>
+    </w:p>
+    <w:p>
+      <w:pPr>
+        <w:pStyle w:val="NormalWeb"/>
+        <w:numPr>
+          <w:ilvl w:val="0"/>
+          <w:numId w:val="0"/>
+        </w:numPr>
+        <w:spacing w:before="0" w:after="280"/>
+        <w:ind w:hanging="0" w:start="720"/>
+        <w:rPr/>
+      </w:pPr>
+      <w:r>
+        <w:rPr/>
+        <w:t>Sample Notice</w:t>
       </w:r>
     </w:p>
     <w:p>
@@ -925,6 +929,7 @@
     <w:qFormat/>
     <w:pPr>
       <w:widowControl/>
+      <w:suppressAutoHyphens w:val="true"/>
       <w:bidi w:val="0"/>
       <w:spacing w:lineRule="auto" w:line="259" w:before="0" w:after="160"/>
       <w:jc w:val="start"/>

</xml_diff>